<commit_message>
update to final report
</commit_message>
<xml_diff>
--- a/Tyler, Final Report.docx
+++ b/Tyler, Final Report.docx
@@ -9,6 +9,11 @@
     </w:p>
     <w:p>
       <w:r>
+        <w:t>ECE 205</w:t>
+      </w:r>
+    </w:p>
+    <w:p>
+      <w:r>
         <w:t>Tyler Palam</w:t>
       </w:r>
     </w:p>
@@ -170,6 +175,7 @@
         </w:numPr>
       </w:pPr>
       <w:r>
+        <w:lastRenderedPageBreak/>
         <w:t>The player can press R to restart.</w:t>
       </w:r>
     </w:p>
@@ -181,7 +187,6 @@
         </w:numPr>
       </w:pPr>
       <w:r>
-        <w:lastRenderedPageBreak/>
         <w:t>If the player reaches the finish line, the game enters the complete state.</w:t>
       </w:r>
     </w:p>
@@ -937,6 +942,7 @@
     </w:p>
     <w:p>
       <w:r>
+        <w:lastRenderedPageBreak/>
         <w:t xml:space="preserve">The main game loop. </w:t>
       </w:r>
       <w:r>
@@ -957,7 +963,6 @@
           <w:bCs/>
           <w:highlight w:val="yellow"/>
         </w:rPr>
-        <w:lastRenderedPageBreak/>
         <w:t>Classes and Relationships</w:t>
       </w:r>
     </w:p>
@@ -2238,7 +2243,6 @@
     <w:p/>
     <w:p>
       <w:r>
-        <w:lastRenderedPageBreak/>
         <w:t>The Player class controls the square character. It stores the player’s shape, speed, gravity, jump velocity, alive status, and whether the player is on the ground.</w:t>
       </w:r>
     </w:p>
@@ -4069,7 +4073,6 @@
     <w:p/>
     <w:p>
       <w:r>
-        <w:lastRenderedPageBreak/>
         <w:t xml:space="preserve">Abstract base class Obstacle and further derived classes Spike and </w:t>
       </w:r>
       <w:proofErr w:type="spellStart"/>
@@ -6216,7 +6219,6 @@
           <w:b/>
           <w:bCs/>
         </w:rPr>
-        <w:lastRenderedPageBreak/>
         <w:t>Inheritance and Composition</w:t>
       </w:r>
     </w:p>
@@ -7595,7 +7597,6 @@
     <w:p/>
     <w:p>
       <w:r>
-        <w:lastRenderedPageBreak/>
         <w:t>For saw blades, the factory creates the correct obstacle subclass:</w:t>
       </w:r>
     </w:p>
@@ -7946,7 +7947,13 @@
       </w:r>
       <w:proofErr w:type="spellEnd"/>
       <w:r>
-        <w:t xml:space="preserve"> and OOP over the course of this project. I also learned the importance of design patterns in creating a complex game. I learned much about inheritance, and factory design pattern. I guess the game state manager would also count as a Singleton, since only one state instance is allowed at a time. However, if I were to do things differently, I would have also used strategy to control player movement behavior as it touches power ups and enters portals to become a Galactica type platform game. I would also create a level editing menu so players can create their own levels in-game, thus editing the JSON data, rather than me editing the JSON data by hand. </w:t>
+        <w:t xml:space="preserve"> and OOP over the course of this project. I also learned the importance of design patterns in creating a complex game. I learned much about inheritance, and factory design pattern. I guess the game state manager would also count as a Singleton, since only one state instance is allowed at a time. </w:t>
+      </w:r>
+      <w:r>
+        <w:t>My next step would be to create a separate resource manager class to manage shared resources such as game font, sound effects, and background music. Going forward</w:t>
+      </w:r>
+      <w:r>
+        <w:t xml:space="preserve">, if I were to do things differently, I would have also used strategy to control player movement behavior as it touches power ups and enters portals to become a Galactica type platform game. I would also create a level editing menu so players can create their own levels in-game, thus editing the JSON data, rather than me editing the JSON data by hand. </w:t>
       </w:r>
     </w:p>
     <w:p>
@@ -7971,7 +7978,6 @@
         <w:rPr>
           <w:highlight w:val="yellow"/>
         </w:rPr>
-        <w:lastRenderedPageBreak/>
         <w:t>Peer Reviews</w:t>
       </w:r>
     </w:p>
@@ -7985,13 +7991,7 @@
     </w:p>
     <w:p>
       <w:r>
-        <w:t xml:space="preserve">Brandon’s 3D shooter game was fun and impressive. I liked his use of the Singleton pattern for the score manager, which provided a centralized way to manage the player’s score throughout the game. I also found his use of shaders in SFML interesting because it demonstrated another capability of SFML beyond the features I used in my own project. Overall, the game looked fun to play and is something I would </w:t>
-      </w:r>
-      <w:r>
-        <w:t>play</w:t>
-      </w:r>
-      <w:r>
-        <w:t xml:space="preserve"> myself.</w:t>
+        <w:t>Brandon’s 3D shooter game was fun and impressive. I liked his use of the Singleton pattern for the score manager, which provided a centralized way to manage the player’s score throughout the game. I also found his use of shaders in SFML interesting because it demonstrated another capability of SFML beyond the features I used in my own project. Overall, the game looked fun to play and is something I would play myself.</w:t>
       </w:r>
     </w:p>
     <w:p>
@@ -8046,10 +8046,7 @@
         <w:t xml:space="preserve">would </w:t>
       </w:r>
       <w:r>
-        <w:t>play</w:t>
-      </w:r>
-      <w:r>
-        <w:t xml:space="preserve"> </w:t>
+        <w:t xml:space="preserve">play </w:t>
       </w:r>
       <w:r>
         <w:t>on</w:t>
@@ -8793,6 +8790,7 @@
   <w:style w:type="character" w:default="1" w:styleId="DefaultParagraphFont">
     <w:name w:val="Default Paragraph Font"/>
     <w:uiPriority w:val="1"/>
+    <w:semiHidden/>
     <w:unhideWhenUsed/>
   </w:style>
   <w:style w:type="table" w:default="1" w:styleId="TableNormal">

</xml_diff>